<commit_message>
Bindless MeshRegistry indirection: slim IndirectDrawCommand to 24 bytes
- IndirectDrawCommand: 72 -> 24 bytes (MeshPartId + InstanceBaseOffset + DrawArgs)
- VS looks up buffer indices from MeshRegistry via single MeshPartId root constant
- InstanceDescriptor: 16 -> 20 bytes (added BoneBufferIdx for skeletal animation)
- Animator: per-Skeleton StreamingBuffer<Matrix4x4> bone buffers, shared across SMRs
- SkinnedMeshRenderer: removed IUpdate/IParallel, receives BoneBufferIdx from Animator
- Updated all shaders (gbuffer, foliage, trunk, transparent, skinned, gizmo, ghost,
  light_point, skybox, ocean, grass_mesh, cull_instances) to MeshRegistry pattern
- InstanceBatch: per-batch constants at slots 4-8 (descriptor, sorted, registry,
  materials, transforms)
- terrain_quadtree: InstanceDescriptor stride 16 -> 20 to match common.fx
- MeshRegistry: NumBones -> Reserved3 (bone count now irrelevant for GPU)"
</commit_message>
<xml_diff>
--- a/ssdm_paper_draft.docx
+++ b/ssdm_paper_draft.docx
@@ -2,13 +2,13 @@
 <file path=word/document.xml><?xml version="1.0" encoding="utf-8"?>
 <w:document xmlns:w="http://schemas.openxmlformats.org/wordprocessingml/2006/main" xmlns:m="http://schemas.openxmlformats.org/officeDocument/2006/math" xmlns:r="http://schemas.openxmlformats.org/officeDocument/2006/relationships" xmlns:o="urn:schemas-microsoft-com:office:office" xmlns:v="urn:schemas-microsoft-com:vml" xmlns:w10="urn:schemas-microsoft-com:office:word" xmlns:a="http://schemas.openxmlformats.org/drawingml/2006/main" xmlns:pic="http://schemas.openxmlformats.org/drawingml/2006/picture" xmlns:wp="http://schemas.openxmlformats.org/drawingml/2006/wordprocessingDrawing">
   <w:body>
-    <w:bookmarkStart w:id="26" w:name="X4007b968d36b9386490b89e51119465bea13252"/>
+    <w:bookmarkStart w:id="31" w:name="X5ef428a429b5114ddec819355bb7e1cd20d9a15"/>
     <w:p>
       <w:pPr>
         <w:pStyle w:val="Heading1"/>
       </w:pPr>
       <w:r>
-        <w:t xml:space="preserve">Improving Screen-Space Displacement Mapping with Newton Pyramid Inversion</w:t>
+        <w:t xml:space="preserve">Improving Screen-Space Displacement Mapping with Hierarchical Newton Inversion</w:t>
       </w:r>
     </w:p>
     <w:p>
@@ -76,13 +76,13 @@
           <w:b/>
           <w:bCs/>
         </w:rPr>
-        <w:t xml:space="preserve">coarse-seeded Newton inversion</w:t>
-      </w:r>
-      <w:r>
-        <w:t xml:space="preserve"> </w:t>
-      </w:r>
-      <w:r>
-        <w:t xml:space="preserve">that seeds directly from the coarsest mip level, then converges at full resolution via damped Newton iterations — eliminating fold-over artifacts while reducing the number of required pyramid levels. We also contribute three practical extensions: a half-precision sentinel scheme that eliminates sub-pixel jitter on non-displaced geometry, integration with screen-space contact shadows via GBuffer linear depth biasing, and a displacement-proportional edge fade for screen boundaries.</w:t>
+        <w:t xml:space="preserve">hierarchical Newton inversion</w:t>
+      </w:r>
+      <w:r>
+        <w:t xml:space="preserve"> </w:t>
+      </w:r>
+      <w:r>
+        <w:t xml:space="preserve">that seeds from the identity mapping and ascends through the mip pyramid from coarsest to finest resolution, applying Newton error correction at each level with an inverse annealing step schedule — gentle steps at coarse mips for safe basin discovery, aggressive steps at fine mips for precise convergence. This virtually eliminates fold-over artifacts while requiring only four iterations and four mip levels. We also contribute three practical extensions: a half-precision sentinel scheme that eliminates sub-pixel jitter on non-displaced geometry, integration with screen-space contact shadows via hardware depth biasing, and a displacement-proportional edge fade for screen boundaries.</w:t>
       </w:r>
     </w:p>
     <w:p>
@@ -148,13 +148,13 @@
           <w:b/>
           <w:bCs/>
         </w:rPr>
-        <w:t xml:space="preserve">Newton inversion</w:t>
-      </w:r>
-      <w:r>
-        <w:t xml:space="preserve"> </w:t>
-      </w:r>
-      <w:r>
-        <w:t xml:space="preserve">— replacing the level-by-level barycentric descent with a coarse-seeded Newton iteration that converges faster and handles discontinuities more robustly (§3.1)</w:t>
+        <w:t xml:space="preserve">Hierarchical Newton inversion</w:t>
+      </w:r>
+      <w:r>
+        <w:t xml:space="preserve"> </w:t>
+      </w:r>
+      <w:r>
+        <w:t xml:space="preserve">— replacing the level-by-level barycentric descent with an identity-seeded Newton iteration that ascends the mip pyramid with an inverse annealing schedule, virtually eliminating fold-over artifacts (§3.1)</w:t>
       </w:r>
     </w:p>
     <w:p>
@@ -176,7 +176,19 @@
         <w:t xml:space="preserve"> </w:t>
       </w:r>
       <w:r>
-        <w:t xml:space="preserve">— embedding displacement into the GBuffer’s linear depth, enabling screen-space contact shadows to naturally see displaced surface detail (§3.2)</w:t>
+        <w:t xml:space="preserve">— embedding displacement into hardware depth via</w:t>
+      </w:r>
+      <w:r>
+        <w:t xml:space="preserve"> </w:t>
+      </w:r>
+      <w:r>
+        <w:rPr>
+          <w:rStyle w:val="VerbatimChar"/>
+        </w:rPr>
+        <w:t xml:space="preserve">SV_DepthGreaterEqual</w:t>
+      </w:r>
+      <w:r>
+        <w:t xml:space="preserve">, enabling screen-space contact shadows to naturally see displaced surface detail (§3.2)</w:t>
       </w:r>
     </w:p>
     <w:p>
@@ -326,7 +338,7 @@
         <w:t xml:space="preserve"> </w:t>
       </w:r>
       <w:r>
-        <w:t xml:space="preserve">[Wang et al. 2004] formalizes displacement field inversion. Newton’s method is a natural choice for this inversion, but requires a good initial seed to avoid divergence at discontinuities — which the mip pyramid provides.</w:t>
+        <w:t xml:space="preserve">[Wang et al. 2004] formalizes displacement field inversion. Newton’s method is a natural choice for this inversion, but requires careful step control to avoid divergence at discontinuities — which the mip pyramid and annealing schedule provide.</w:t>
       </w:r>
     </w:p>
     <w:p>
@@ -337,7 +349,7 @@
       </w:r>
     </w:p>
     <w:bookmarkEnd w:id="12"/>
-    <w:bookmarkStart w:id="17" w:name="method"/>
+    <w:bookmarkStart w:id="21" w:name="method"/>
     <w:p>
       <w:pPr>
         <w:pStyle w:val="Heading2"/>
@@ -354,13 +366,22 @@
         <w:t xml:space="preserve">We retain Lobel’s overall architecture — forward displacement vectors stored during the GBuffer pass, a mip pyramid A, and an inverted B buffer consumed by the lighting/composition stages. Our changes are concentrated in the inversion step and in practical integration details.</w:t>
       </w:r>
     </w:p>
-    <w:bookmarkStart w:id="13" w:name="coarse-seeded-newton-inversion"/>
+    <w:bookmarkStart w:id="17" w:name="hierarchical-newton-inversion"/>
     <w:p>
       <w:pPr>
         <w:pStyle w:val="Heading3"/>
       </w:pPr>
       <w:r>
-        <w:t xml:space="preserve">3.1 Coarse-Seeded Newton Inversion</w:t>
+        <w:t xml:space="preserve">3.1 Hierarchical Newton Inversion</w:t>
+      </w:r>
+    </w:p>
+    <w:bookmarkStart w:id="13" w:name="background-the-fold-over-problem"/>
+    <w:p>
+      <w:pPr>
+        <w:pStyle w:val="Heading4"/>
+      </w:pPr>
+      <w:r>
+        <w:t xml:space="preserve">3.1.1 Background: The Fold-Over Problem</w:t>
       </w:r>
     </w:p>
     <w:p>
@@ -368,208 +389,7 @@
         <w:pStyle w:val="FirstParagraph"/>
       </w:pPr>
       <w:r>
-        <w:t xml:space="preserve">Lobel’s original inversion descends the pyramid level-by-level, refining at each step. This requires building and processing all intermediate levels, and the barycentric averaging can propagate errors across discontinuities.</w:t>
-      </w:r>
-    </w:p>
-    <w:p>
-      <w:pPr>
-        <w:pStyle w:val="BodyText"/>
-      </w:pPr>
-      <w:r>
-        <w:t xml:space="preserve">We observe that the coarsest mip level alone provides a sufficient seed — it is smooth and fold-free by construction (sharp edges are averaged away). From this seed, we jump directly to full resolution and apply damped Newton iterations to converge:</w:t>
-      </w:r>
-    </w:p>
-    <w:p>
-      <w:pPr>
-        <w:pStyle w:val="SourceCode"/>
-      </w:pPr>
-      <w:r>
-        <w:rPr>
-          <w:rStyle w:val="VerbatimChar"/>
-        </w:rPr>
-        <w:t xml:space="preserve">void CSRefine(uint3 dtid : SV_DispatchThreadID)</w:t>
-      </w:r>
-      <w:r>
-        <w:br/>
-      </w:r>
-      <w:r>
-        <w:rPr>
-          <w:rStyle w:val="VerbatimChar"/>
-        </w:rPr>
-        <w:t xml:space="preserve">{</w:t>
-      </w:r>
-      <w:r>
-        <w:br/>
-      </w:r>
-      <w:r>
-        <w:rPr>
-          <w:rStyle w:val="VerbatimChar"/>
-        </w:rPr>
-        <w:t xml:space="preserve">    float2 myUV = (float2(dtid.xy) + 0.5) * invSize;</w:t>
-      </w:r>
-      <w:r>
-        <w:br/>
-      </w:r>
-      <w:r>
-        <w:br/>
-      </w:r>
-      <w:r>
-        <w:rPr>
-          <w:rStyle w:val="VerbatimChar"/>
-        </w:rPr>
-        <w:t xml:space="preserve">    // Skip non-displaced pixels (sentinel, §3.3)</w:t>
-      </w:r>
-      <w:r>
-        <w:br/>
-      </w:r>
-      <w:r>
-        <w:rPr>
-          <w:rStyle w:val="VerbatimChar"/>
-        </w:rPr>
-        <w:t xml:space="preserve">    float2 myDisp = pyramidA.Load(int3(dtid.xy, 0));</w:t>
-      </w:r>
-      <w:r>
-        <w:br/>
-      </w:r>
-      <w:r>
-        <w:rPr>
-          <w:rStyle w:val="VerbatimChar"/>
-        </w:rPr>
-        <w:t xml:space="preserve">    if (all(myDisp == 0)) { dstB[dtid.xy] = float2(0, 0); return; }</w:t>
-      </w:r>
-      <w:r>
-        <w:br/>
-      </w:r>
-      <w:r>
-        <w:br/>
-      </w:r>
-      <w:r>
-        <w:rPr>
-          <w:rStyle w:val="VerbatimChar"/>
-        </w:rPr>
-        <w:t xml:space="preserve">    // Seed from coarsest mip (smooth, fold-free)</w:t>
-      </w:r>
-      <w:r>
-        <w:br/>
-      </w:r>
-      <w:r>
-        <w:rPr>
-          <w:rStyle w:val="VerbatimChar"/>
-        </w:rPr>
-        <w:t xml:space="preserve">    int coarseMip = min(MipCount - 1, 7);</w:t>
-      </w:r>
-      <w:r>
-        <w:br/>
-      </w:r>
-      <w:r>
-        <w:rPr>
-          <w:rStyle w:val="VerbatimChar"/>
-        </w:rPr>
-        <w:t xml:space="preserve">    float2 d_coarse = pyramidA.SampleLevel(BilinearClamp, myUV, coarseMip);</w:t>
-      </w:r>
-      <w:r>
-        <w:br/>
-      </w:r>
-      <w:r>
-        <w:rPr>
-          <w:rStyle w:val="VerbatimChar"/>
-        </w:rPr>
-        <w:t xml:space="preserve">    float2 source = myUV - d_coarse;</w:t>
-      </w:r>
-      <w:r>
-        <w:br/>
-      </w:r>
-      <w:r>
-        <w:br/>
-      </w:r>
-      <w:r>
-        <w:rPr>
-          <w:rStyle w:val="VerbatimChar"/>
-        </w:rPr>
-        <w:t xml:space="preserve">    // Damped Newton iterations at full resolution</w:t>
-      </w:r>
-      <w:r>
-        <w:br/>
-      </w:r>
-      <w:r>
-        <w:rPr>
-          <w:rStyle w:val="VerbatimChar"/>
-        </w:rPr>
-        <w:t xml:space="preserve">    for (int i = 0; i &lt; 4; i++)</w:t>
-      </w:r>
-      <w:r>
-        <w:br/>
-      </w:r>
-      <w:r>
-        <w:rPr>
-          <w:rStyle w:val="VerbatimChar"/>
-        </w:rPr>
-        <w:t xml:space="preserve">    {</w:t>
-      </w:r>
-      <w:r>
-        <w:br/>
-      </w:r>
-      <w:r>
-        <w:rPr>
-          <w:rStyle w:val="VerbatimChar"/>
-        </w:rPr>
-        <w:t xml:space="preserve">        float2 d_full = pyramidA.SampleLevel(BilinearClamp, source, 0);</w:t>
-      </w:r>
-      <w:r>
-        <w:br/>
-      </w:r>
-      <w:r>
-        <w:rPr>
-          <w:rStyle w:val="VerbatimChar"/>
-        </w:rPr>
-        <w:t xml:space="preserve">        float2 error = (source + d_full) - myUV;</w:t>
-      </w:r>
-      <w:r>
-        <w:br/>
-      </w:r>
-      <w:r>
-        <w:rPr>
-          <w:rStyle w:val="VerbatimChar"/>
-        </w:rPr>
-        <w:t xml:space="preserve">        source -= error * 0.5; // damping factor</w:t>
-      </w:r>
-      <w:r>
-        <w:br/>
-      </w:r>
-      <w:r>
-        <w:rPr>
-          <w:rStyle w:val="VerbatimChar"/>
-        </w:rPr>
-        <w:t xml:space="preserve">    }</w:t>
-      </w:r>
-      <w:r>
-        <w:br/>
-      </w:r>
-      <w:r>
-        <w:br/>
-      </w:r>
-      <w:r>
-        <w:rPr>
-          <w:rStyle w:val="VerbatimChar"/>
-        </w:rPr>
-        <w:t xml:space="preserve">    dstB[dtid.xy] = source;</w:t>
-      </w:r>
-      <w:r>
-        <w:br/>
-      </w:r>
-      <w:r>
-        <w:rPr>
-          <w:rStyle w:val="VerbatimChar"/>
-        </w:rPr>
-        <w:t xml:space="preserve">}</w:t>
-      </w:r>
-    </w:p>
-    <w:p>
-      <w:pPr>
-        <w:pStyle w:val="FirstParagraph"/>
-      </w:pPr>
-      <w:r>
-        <w:t xml:space="preserve">For each destination pixel</w:t>
+        <w:t xml:space="preserve">The central challenge of SSDM inversion is the</w:t>
       </w:r>
       <w:r>
         <w:t xml:space="preserve"> </w:t>
@@ -579,10 +399,18 @@
           <w:b/>
           <w:bCs/>
         </w:rPr>
-        <w:t xml:space="preserve">d</w:t>
-      </w:r>
-      <w:r>
-        <w:t xml:space="preserve">, we seek the source</w:t>
+        <w:t xml:space="preserve">fold-over problem</w:t>
+      </w:r>
+      <w:r>
+        <w:t xml:space="preserve">. A convex displacement feature (e.g., a cobblestone) causes forward displacement vectors to converge on the camera-facing slope — multiple source pixels map to the same destination region. This creates a non-injective mapping where the inverse is multi-valued. Any inversion scheme must handle this gracefully.</w:t>
+      </w:r>
+    </w:p>
+    <w:p>
+      <w:pPr>
+        <w:pStyle w:val="BodyText"/>
+      </w:pPr>
+      <w:r>
+        <w:t xml:space="preserve">Lobel’s level-by-level descent propagates fold-over from coarse levels to fine ones. A naïve Newton iteration seeded from the coarsest mip can overshoot into wrong basins at sharp displacement transitions. We found through extensive experimentation that the key to eliminating folds lies in the</w:t>
       </w:r>
       <w:r>
         <w:t xml:space="preserve"> </w:t>
@@ -592,86 +420,271 @@
           <w:b/>
           <w:bCs/>
         </w:rPr>
-        <w:t xml:space="preserve">s</w:t>
-      </w:r>
-      <w:r>
-        <w:t xml:space="preserve"> </w:t>
-      </w:r>
-      <w:r>
-        <w:t xml:space="preserve">satisfying</w:t>
-      </w:r>
-      <w:r>
-        <w:t xml:space="preserve"> </w:t>
-      </w:r>
-      <w:r>
-        <w:rPr>
-          <w:rStyle w:val="VerbatimChar"/>
-        </w:rPr>
-        <w:t xml:space="preserve">s + A(s) = d</w:t>
-      </w:r>
-      <w:r>
-        <w:t xml:space="preserve">. The Newton step computes the forward mapping error</w:t>
-      </w:r>
-      <w:r>
-        <w:t xml:space="preserve"> </w:t>
-      </w:r>
-      <w:r>
-        <w:rPr>
-          <w:rStyle w:val="VerbatimChar"/>
-        </w:rPr>
-        <w:t xml:space="preserve">e = (s + A(s)) - d</w:t>
-      </w:r>
-      <w:r>
-        <w:t xml:space="preserve"> </w:t>
-      </w:r>
-      <w:r>
-        <w:t xml:space="preserve">and corrects with a damping factor of 0.5 to prevent overshooting at high-gradient boundaries. Four iterations are sufficient for sub-pixel convergence in practice.</w:t>
-      </w:r>
-    </w:p>
-    <w:p>
-      <w:pPr>
-        <w:pStyle w:val="BodyText"/>
-      </w:pPr>
+        <w:t xml:space="preserve">step schedule</w:t>
+      </w:r>
+      <w:r>
+        <w:t xml:space="preserve">: how aggressively Newton corrects at each pyramid level.</w:t>
+      </w:r>
+    </w:p>
+    <w:bookmarkEnd w:id="13"/>
+    <w:bookmarkStart w:id="14" w:name="algorithm"/>
+    <w:p>
+      <w:pPr>
+        <w:pStyle w:val="Heading4"/>
+      </w:pPr>
+      <w:r>
+        <w:t xml:space="preserve">3.1.2 Algorithm</w:t>
+      </w:r>
+    </w:p>
+    <w:p>
+      <w:pPr>
+        <w:pStyle w:val="FirstParagraph"/>
+      </w:pPr>
+      <w:r>
+        <w:t xml:space="preserve">We seed from the</w:t>
+      </w:r>
+      <w:r>
+        <w:t xml:space="preserve"> </w:t>
+      </w:r>
       <w:r>
         <w:rPr>
           <w:b/>
           <w:bCs/>
         </w:rPr>
-        <w:t xml:space="preserve">Advantages over level-by-level descent:</w:t>
-      </w:r>
-      <w:r>
-        <w:t xml:space="preserve"> </w:t>
-      </w:r>
-      <w:r>
-        <w:t xml:space="preserve">- Only the coarsest and finest mip levels are needed (intermediate levels are unused)</w:t>
-      </w:r>
-      <w:r>
-        <w:t xml:space="preserve"> </w:t>
-      </w:r>
-      <w:r>
-        <w:t xml:space="preserve">- The single-jump seed avoids accumulating interpolation error across levels</w:t>
-      </w:r>
-      <w:r>
-        <w:t xml:space="preserve"> </w:t>
-      </w:r>
-      <w:r>
-        <w:t xml:space="preserve">- Newton convergence is quadratic near the solution, requiring fewer total samples</w:t>
-      </w:r>
-      <w:r>
-        <w:t xml:space="preserve"> </w:t>
-      </w:r>
-      <w:r>
-        <w:t xml:space="preserve">- The damping factor provides explicit control over the fold-over/accuracy tradeoff</w:t>
-      </w:r>
-    </w:p>
-    <w:bookmarkEnd w:id="13"/>
-    <w:bookmarkStart w:id="14" w:name="X67f93c588895ccb0422c4969fc428e7fdce236f"/>
-    <w:p>
-      <w:pPr>
-        <w:pStyle w:val="Heading3"/>
-      </w:pPr>
-      <w:r>
-        <w:t xml:space="preserve">3.2 GBuffer Depth Biasing for Screen-Space Shadows</w:t>
+        <w:t xml:space="preserve">identity mapping</w:t>
+      </w:r>
+      <w:r>
+        <w:t xml:space="preserve"> </w:t>
+      </w:r>
+      <w:r>
+        <w:t xml:space="preserve">(</w:t>
+      </w:r>
+      <w:r>
+        <w:rPr>
+          <w:rStyle w:val="VerbatimChar"/>
+        </w:rPr>
+        <w:t xml:space="preserve">source = myUV</w:t>
+      </w:r>
+      <w:r>
+        <w:t xml:space="preserve">) and ascend the mip pyramid from coarsest to finest, applying one Newton correction per level:</w:t>
+      </w:r>
+    </w:p>
+    <w:p>
+      <w:pPr>
+        <w:pStyle w:val="SourceCode"/>
+      </w:pPr>
+      <w:r>
+        <w:rPr>
+          <w:rStyle w:val="VerbatimChar"/>
+        </w:rPr>
+        <w:t xml:space="preserve">void CSRefine(uint3 dtid : SV_DispatchThreadID)</w:t>
+      </w:r>
+      <w:r>
+        <w:br/>
+      </w:r>
+      <w:r>
+        <w:rPr>
+          <w:rStyle w:val="VerbatimChar"/>
+        </w:rPr>
+        <w:t xml:space="preserve">{</w:t>
+      </w:r>
+      <w:r>
+        <w:br/>
+      </w:r>
+      <w:r>
+        <w:rPr>
+          <w:rStyle w:val="VerbatimChar"/>
+        </w:rPr>
+        <w:t xml:space="preserve">    float2 myUV = (float2(dtid.xy) + 0.5) * invSize;</w:t>
+      </w:r>
+      <w:r>
+        <w:br/>
+      </w:r>
+      <w:r>
+        <w:br/>
+      </w:r>
+      <w:r>
+        <w:rPr>
+          <w:rStyle w:val="VerbatimChar"/>
+        </w:rPr>
+        <w:t xml:space="preserve">    // Skip non-displaced pixels (sentinel, §3.3)</w:t>
+      </w:r>
+      <w:r>
+        <w:br/>
+      </w:r>
+      <w:r>
+        <w:rPr>
+          <w:rStyle w:val="VerbatimChar"/>
+        </w:rPr>
+        <w:t xml:space="preserve">    float2 myDisp = pyramidA.Load(int3(dtid.xy, 0));</w:t>
+      </w:r>
+      <w:r>
+        <w:br/>
+      </w:r>
+      <w:r>
+        <w:rPr>
+          <w:rStyle w:val="VerbatimChar"/>
+        </w:rPr>
+        <w:t xml:space="preserve">    if (all(myDisp == 0)) { dstB[dtid.xy] = float2(0, 0); return; }</w:t>
+      </w:r>
+      <w:r>
+        <w:br/>
+      </w:r>
+      <w:r>
+        <w:br/>
+      </w:r>
+      <w:r>
+        <w:rPr>
+          <w:rStyle w:val="VerbatimChar"/>
+        </w:rPr>
+        <w:t xml:space="preserve">    float2 source = myUV;  // identity seed</w:t>
+      </w:r>
+      <w:r>
+        <w:br/>
+      </w:r>
+      <w:r>
+        <w:rPr>
+          <w:rStyle w:val="VerbatimChar"/>
+        </w:rPr>
+        <w:t xml:space="preserve">    float maxExtentSq = max(DstWidth, DstHeight);</w:t>
+      </w:r>
+      <w:r>
+        <w:br/>
+      </w:r>
+      <w:r>
+        <w:rPr>
+          <w:rStyle w:val="VerbatimChar"/>
+        </w:rPr>
+        <w:t xml:space="preserve">    maxExtentSq *= maxExtentSq;</w:t>
+      </w:r>
+      <w:r>
+        <w:br/>
+      </w:r>
+      <w:r>
+        <w:br/>
+      </w:r>
+      <w:r>
+        <w:rPr>
+          <w:rStyle w:val="VerbatimChar"/>
+        </w:rPr>
+        <w:t xml:space="preserve">    // Ascending hierarchical Newton with inverse annealing</w:t>
+      </w:r>
+      <w:r>
+        <w:br/>
+      </w:r>
+      <w:r>
+        <w:rPr>
+          <w:rStyle w:val="VerbatimChar"/>
+        </w:rPr>
+        <w:t xml:space="preserve">    [unroll]</w:t>
+      </w:r>
+      <w:r>
+        <w:br/>
+      </w:r>
+      <w:r>
+        <w:rPr>
+          <w:rStyle w:val="VerbatimChar"/>
+        </w:rPr>
+        <w:t xml:space="preserve">    for (int i = 3; i &gt;= 0; i--)</w:t>
+      </w:r>
+      <w:r>
+        <w:br/>
+      </w:r>
+      <w:r>
+        <w:rPr>
+          <w:rStyle w:val="VerbatimChar"/>
+        </w:rPr>
+        <w:t xml:space="preserve">    {</w:t>
+      </w:r>
+      <w:r>
+        <w:br/>
+      </w:r>
+      <w:r>
+        <w:rPr>
+          <w:rStyle w:val="VerbatimChar"/>
+        </w:rPr>
+        <w:t xml:space="preserve">        float2 d = pyramidA.SampleLevel(BilinearClamp, source, i);</w:t>
+      </w:r>
+      <w:r>
+        <w:br/>
+      </w:r>
+      <w:r>
+        <w:rPr>
+          <w:rStyle w:val="VerbatimChar"/>
+        </w:rPr>
+        <w:t xml:space="preserve">        float2 error = myUV - (source + d);</w:t>
+      </w:r>
+      <w:r>
+        <w:br/>
+      </w:r>
+      <w:r>
+        <w:br/>
+      </w:r>
+      <w:r>
+        <w:rPr>
+          <w:rStyle w:val="VerbatimChar"/>
+        </w:rPr>
+        <w:t xml:space="preserve">        float step = 0.33 / (1.0 + i);</w:t>
+      </w:r>
+      <w:r>
+        <w:br/>
+      </w:r>
+      <w:r>
+        <w:rPr>
+          <w:rStyle w:val="VerbatimChar"/>
+        </w:rPr>
+        <w:t xml:space="preserve">        if (dot(error, error) * maxExtentSq &lt; step * step)</w:t>
+      </w:r>
+      <w:r>
+        <w:br/>
+      </w:r>
+      <w:r>
+        <w:rPr>
+          <w:rStyle w:val="VerbatimChar"/>
+        </w:rPr>
+        <w:t xml:space="preserve">            break;</w:t>
+      </w:r>
+      <w:r>
+        <w:br/>
+      </w:r>
+      <w:r>
+        <w:br/>
+      </w:r>
+      <w:r>
+        <w:rPr>
+          <w:rStyle w:val="VerbatimChar"/>
+        </w:rPr>
+        <w:t xml:space="preserve">        source += error * step;</w:t>
+      </w:r>
+      <w:r>
+        <w:br/>
+      </w:r>
+      <w:r>
+        <w:rPr>
+          <w:rStyle w:val="VerbatimChar"/>
+        </w:rPr>
+        <w:t xml:space="preserve">    }</w:t>
+      </w:r>
+      <w:r>
+        <w:br/>
+      </w:r>
+      <w:r>
+        <w:br/>
+      </w:r>
+      <w:r>
+        <w:rPr>
+          <w:rStyle w:val="VerbatimChar"/>
+        </w:rPr>
+        <w:t xml:space="preserve">    dstB[dtid.xy] = source;</w:t>
+      </w:r>
+      <w:r>
+        <w:br/>
+      </w:r>
+      <w:r>
+        <w:rPr>
+          <w:rStyle w:val="VerbatimChar"/>
+        </w:rPr>
+        <w:t xml:space="preserve">}</w:t>
       </w:r>
     </w:p>
     <w:p>
@@ -679,174 +692,655 @@
         <w:pStyle w:val="FirstParagraph"/>
       </w:pPr>
       <w:r>
-        <w:t xml:space="preserve">The terrain pixel shader writes height-biased linear depth to the GBuffer:</w:t>
-      </w:r>
-    </w:p>
-    <w:p>
-      <w:pPr>
-        <w:pStyle w:val="SourceCode"/>
-      </w:pPr>
-      <w:r>
-        <w:rPr>
-          <w:rStyle w:val="VerbatimChar"/>
-        </w:rPr>
-        <w:t xml:space="preserve">output.Depth = input.Depth - worldHeight * dot(faceNormal, viewDir);</w:t>
-      </w:r>
-    </w:p>
-    <w:p>
-      <w:pPr>
-        <w:pStyle w:val="FirstParagraph"/>
-      </w:pPr>
-      <w:r>
-        <w:t xml:space="preserve">Screen-space contact shadow techniques [Bend Studio 2022] ray-march against a depth buffer to detect occlusion. By embedding displacement into the GBuffer’s linear depth, the shadow pass naturally sees heightmap features as occluders — producing correct micro-shadows without any modification to the shadow algorithm itself.</w:t>
-      </w:r>
-    </w:p>
-    <w:p>
-      <w:pPr>
-        <w:pStyle w:val="BodyText"/>
-      </w:pPr>
-      <w:r>
-        <w:t xml:space="preserve">To avoid writing to</w:t>
-      </w:r>
-      <w:r>
-        <w:t xml:space="preserve"> </w:t>
-      </w:r>
-      <w:r>
-        <w:rPr>
-          <w:rStyle w:val="VerbatimChar"/>
-        </w:rPr>
-        <w:t xml:space="preserve">SV_DepthGreaterEqual</w:t>
-      </w:r>
-      <w:r>
-        <w:t xml:space="preserve"> </w:t>
-      </w:r>
-      <w:r>
-        <w:t xml:space="preserve">(which requires</w:t>
-      </w:r>
-      <w:r>
-        <w:t xml:space="preserve"> </w:t>
-      </w:r>
-      <w:r>
-        <w:rPr>
-          <w:rStyle w:val="VerbatimChar"/>
-        </w:rPr>
-        <w:t xml:space="preserve">noperspective centroid</w:t>
-      </w:r>
-      <w:r>
-        <w:t xml:space="preserve"> </w:t>
-      </w:r>
-      <w:r>
-        <w:t xml:space="preserve">interpolation, disables early-Z, and introduces aliasing at mesh edges), the shadow pass reads the GBuffer linear depth and converts to pseudo-reverse-Z:</w:t>
-      </w:r>
-    </w:p>
-    <w:p>
-      <w:pPr>
-        <w:pStyle w:val="SourceCode"/>
-      </w:pPr>
-      <w:r>
-        <w:rPr>
-          <w:rStyle w:val="VerbatimChar"/>
-        </w:rPr>
-        <w:t xml:space="preserve">float ReadDepth(int2 coord)</w:t>
-      </w:r>
-      <w:r>
-        <w:br/>
-      </w:r>
-      <w:r>
-        <w:rPr>
-          <w:rStyle w:val="VerbatimChar"/>
-        </w:rPr>
-        <w:t xml:space="preserve">{</w:t>
-      </w:r>
-      <w:r>
-        <w:br/>
-      </w:r>
-      <w:r>
-        <w:rPr>
-          <w:rStyle w:val="VerbatimChar"/>
-        </w:rPr>
-        <w:t xml:space="preserve">    float linearDepth = depthTex.Load(int3(coord, 0));</w:t>
-      </w:r>
-      <w:r>
-        <w:br/>
-      </w:r>
-      <w:r>
-        <w:rPr>
-          <w:rStyle w:val="VerbatimChar"/>
-        </w:rPr>
-        <w:t xml:space="preserve">    if (linearDepth &lt;= 0) return 0; // sky/clear</w:t>
-      </w:r>
-      <w:r>
-        <w:br/>
-      </w:r>
-      <w:r>
-        <w:rPr>
-          <w:rStyle w:val="VerbatimChar"/>
-        </w:rPr>
-        <w:t xml:space="preserve">    return NearPlane / linearDepth;  // pseudo reverse-Z</w:t>
-      </w:r>
-      <w:r>
-        <w:br/>
-      </w:r>
-      <w:r>
-        <w:rPr>
-          <w:rStyle w:val="VerbatimChar"/>
-        </w:rPr>
-        <w:t xml:space="preserve">}</w:t>
-      </w:r>
-    </w:p>
-    <w:p>
-      <w:pPr>
-        <w:pStyle w:val="FirstParagraph"/>
-      </w:pPr>
-      <w:r>
-        <w:t xml:space="preserve">This keeps the hardware depth buffer clean for z-testing, SSAO, and other consumers.</w:t>
-      </w:r>
-    </w:p>
-    <w:bookmarkEnd w:id="14"/>
-    <w:bookmarkStart w:id="15" w:name="half-precision-sentinel"/>
-    <w:p>
-      <w:pPr>
-        <w:pStyle w:val="Heading3"/>
-      </w:pPr>
-      <w:r>
-        <w:t xml:space="preserve">3.3 Half-Precision Sentinel</w:t>
-      </w:r>
-    </w:p>
-    <w:p>
-      <w:pPr>
-        <w:pStyle w:val="FirstParagraph"/>
-      </w:pPr>
-      <w:r>
-        <w:t xml:space="preserve">The B buffer uses R16G16_Float for memory efficiency, following Lobel’s original use of half-float storage. However, half-precision cannot exactly represent arbitrary UV coordinates — at 1920px width, the quantization error can exceed 1 pixel near screen edges.</w:t>
-      </w:r>
-    </w:p>
-    <w:p>
-      <w:pPr>
-        <w:pStyle w:val="BodyText"/>
-      </w:pPr>
-      <w:r>
-        <w:t xml:space="preserve">For non-displaced pixels (meshes, sky), Lobel’s formulation stores the identity UV (</w:t>
-      </w:r>
-      <w:r>
-        <w:rPr>
-          <w:rStyle w:val="VerbatimChar"/>
-        </w:rPr>
-        <w:t xml:space="preserve">myUV</w:t>
-      </w:r>
-      <w:r>
-        <w:t xml:space="preserve">), which should produce zero offset. In half-precision, this identity is quantized, introducing random ±1px jitter that manifests as visible halos at object silhouettes.</w:t>
-      </w:r>
-    </w:p>
-    <w:p>
-      <w:pPr>
-        <w:pStyle w:val="BodyText"/>
-      </w:pPr>
+        <w:t xml:space="preserve">For each destination pixel</w:t>
+      </w:r>
+      <w:r>
+        <w:t xml:space="preserve"> </w:t>
+      </w:r>
       <w:r>
         <w:rPr>
           <w:b/>
           <w:bCs/>
         </w:rPr>
+        <w:t xml:space="preserve">d</w:t>
+      </w:r>
+      <w:r>
+        <w:t xml:space="preserve">, we seek the source</w:t>
+      </w:r>
+      <w:r>
+        <w:t xml:space="preserve"> </w:t>
+      </w:r>
+      <w:r>
+        <w:rPr>
+          <w:b/>
+          <w:bCs/>
+        </w:rPr>
+        <w:t xml:space="preserve">s</w:t>
+      </w:r>
+      <w:r>
+        <w:t xml:space="preserve"> </w:t>
+      </w:r>
+      <w:r>
+        <w:t xml:space="preserve">satisfying</w:t>
+      </w:r>
+      <w:r>
+        <w:t xml:space="preserve"> </w:t>
+      </w:r>
+      <w:r>
+        <w:rPr>
+          <w:rStyle w:val="VerbatimChar"/>
+        </w:rPr>
+        <w:t xml:space="preserve">s + A(s) = d</w:t>
+      </w:r>
+      <w:r>
+        <w:t xml:space="preserve">. The algorithm iterates from mip 3 (coarsest) to mip 0 (finest), computing the forward-mapping error at each level and applying a damped correction. The early-out condition uses squared distance to avoid a per-pixel sqrt.</w:t>
+      </w:r>
+    </w:p>
+    <w:bookmarkEnd w:id="14"/>
+    <w:bookmarkStart w:id="15" w:name="the-inverse-annealing-step-schedule"/>
+    <w:p>
+      <w:pPr>
+        <w:pStyle w:val="Heading4"/>
+      </w:pPr>
+      <w:r>
+        <w:t xml:space="preserve">3.1.3 The Inverse Annealing Step Schedule</w:t>
+      </w:r>
+    </w:p>
+    <w:p>
+      <w:pPr>
+        <w:pStyle w:val="FirstParagraph"/>
+      </w:pPr>
+      <w:r>
+        <w:t xml:space="preserve">The step factor</w:t>
+      </w:r>
+      <w:r>
+        <w:t xml:space="preserve"> </w:t>
+      </w:r>
+      <w:r>
+        <w:rPr>
+          <w:rStyle w:val="VerbatimChar"/>
+        </w:rPr>
+        <w:t xml:space="preserve">k / (1 + mipLevel)</w:t>
+      </w:r>
+      <w:r>
+        <w:t xml:space="preserve"> </w:t>
+      </w:r>
+      <w:r>
+        <w:t xml:space="preserve">produces:</w:t>
+      </w:r>
+    </w:p>
+    <w:tbl>
+      <w:tblPr>
+        <w:tblStyle w:val="Table"/>
+        <w:tblW w:type="auto" w:w="0"/>
+        <w:tblLook w:firstRow="1" w:lastRow="0" w:firstColumn="0" w:lastColumn="0" w:noHBand="0" w:noVBand="0" w:val="0020"/>
+      </w:tblPr>
+      <w:tblGrid>
+        <w:gridCol w:w="2640"/>
+        <w:gridCol w:w="2640"/>
+        <w:gridCol w:w="2640"/>
+      </w:tblGrid>
+      <w:tr>
+        <w:trPr>
+          <w:tblHeader w:val="on"/>
+        </w:trPr>
+        <w:tc>
+          <w:tcPr/>
+          <w:p>
+            <w:pPr>
+              <w:pStyle w:val="Compact"/>
+            </w:pPr>
+            <w:r>
+              <w:t xml:space="preserve">Iteration</w:t>
+            </w:r>
+          </w:p>
+        </w:tc>
+        <w:tc>
+          <w:tcPr/>
+          <w:p>
+            <w:pPr>
+              <w:pStyle w:val="Compact"/>
+            </w:pPr>
+            <w:r>
+              <w:t xml:space="preserve">Mip Level</w:t>
+            </w:r>
+          </w:p>
+        </w:tc>
+        <w:tc>
+          <w:tcPr/>
+          <w:p>
+            <w:pPr>
+              <w:pStyle w:val="Compact"/>
+            </w:pPr>
+            <w:r>
+              <w:t xml:space="preserve">Step Factor (k=0.33)</w:t>
+            </w:r>
+          </w:p>
+        </w:tc>
+      </w:tr>
+      <w:tr>
+        <w:tc>
+          <w:tcPr/>
+          <w:p>
+            <w:pPr>
+              <w:pStyle w:val="Compact"/>
+            </w:pPr>
+            <w:r>
+              <w:t xml:space="preserve">1</w:t>
+            </w:r>
+          </w:p>
+        </w:tc>
+        <w:tc>
+          <w:tcPr/>
+          <w:p>
+            <w:pPr>
+              <w:pStyle w:val="Compact"/>
+            </w:pPr>
+            <w:r>
+              <w:t xml:space="preserve">3 (coarsest)</w:t>
+            </w:r>
+          </w:p>
+        </w:tc>
+        <w:tc>
+          <w:tcPr/>
+          <w:p>
+            <w:pPr>
+              <w:pStyle w:val="Compact"/>
+            </w:pPr>
+            <w:r>
+              <w:t xml:space="preserve">0.083</w:t>
+            </w:r>
+          </w:p>
+        </w:tc>
+      </w:tr>
+      <w:tr>
+        <w:tc>
+          <w:tcPr/>
+          <w:p>
+            <w:pPr>
+              <w:pStyle w:val="Compact"/>
+            </w:pPr>
+            <w:r>
+              <w:t xml:space="preserve">2</w:t>
+            </w:r>
+          </w:p>
+        </w:tc>
+        <w:tc>
+          <w:tcPr/>
+          <w:p>
+            <w:pPr>
+              <w:pStyle w:val="Compact"/>
+            </w:pPr>
+            <w:r>
+              <w:t xml:space="preserve">2</w:t>
+            </w:r>
+          </w:p>
+        </w:tc>
+        <w:tc>
+          <w:tcPr/>
+          <w:p>
+            <w:pPr>
+              <w:pStyle w:val="Compact"/>
+            </w:pPr>
+            <w:r>
+              <w:t xml:space="preserve">0.110</w:t>
+            </w:r>
+          </w:p>
+        </w:tc>
+      </w:tr>
+      <w:tr>
+        <w:tc>
+          <w:tcPr/>
+          <w:p>
+            <w:pPr>
+              <w:pStyle w:val="Compact"/>
+            </w:pPr>
+            <w:r>
+              <w:t xml:space="preserve">3</w:t>
+            </w:r>
+          </w:p>
+        </w:tc>
+        <w:tc>
+          <w:tcPr/>
+          <w:p>
+            <w:pPr>
+              <w:pStyle w:val="Compact"/>
+            </w:pPr>
+            <w:r>
+              <w:t xml:space="preserve">1</w:t>
+            </w:r>
+          </w:p>
+        </w:tc>
+        <w:tc>
+          <w:tcPr/>
+          <w:p>
+            <w:pPr>
+              <w:pStyle w:val="Compact"/>
+            </w:pPr>
+            <w:r>
+              <w:t xml:space="preserve">0.165</w:t>
+            </w:r>
+          </w:p>
+        </w:tc>
+      </w:tr>
+      <w:tr>
+        <w:tc>
+          <w:tcPr/>
+          <w:p>
+            <w:pPr>
+              <w:pStyle w:val="Compact"/>
+            </w:pPr>
+            <w:r>
+              <w:t xml:space="preserve">4</w:t>
+            </w:r>
+          </w:p>
+        </w:tc>
+        <w:tc>
+          <w:tcPr/>
+          <w:p>
+            <w:pPr>
+              <w:pStyle w:val="Compact"/>
+            </w:pPr>
+            <w:r>
+              <w:t xml:space="preserve">0 (finest)</w:t>
+            </w:r>
+          </w:p>
+        </w:tc>
+        <w:tc>
+          <w:tcPr/>
+          <w:p>
+            <w:pPr>
+              <w:pStyle w:val="Compact"/>
+            </w:pPr>
+            <w:r>
+              <w:t xml:space="preserve">0.330</w:t>
+            </w:r>
+          </w:p>
+        </w:tc>
+      </w:tr>
+    </w:tbl>
+    <w:p>
+      <w:pPr>
+        <w:pStyle w:val="BodyText"/>
+      </w:pPr>
+      <w:r>
+        <w:t xml:space="preserve">This is the</w:t>
+      </w:r>
+      <w:r>
+        <w:t xml:space="preserve"> </w:t>
+      </w:r>
+      <w:r>
+        <w:rPr>
+          <w:b/>
+          <w:bCs/>
+        </w:rPr>
+        <w:t xml:space="preserve">inverse</w:t>
+      </w:r>
+      <w:r>
+        <w:t xml:space="preserve"> </w:t>
+      </w:r>
+      <w:r>
+        <w:t xml:space="preserve">of the typical Newton damping schedule (which starts aggressive and reduces). The rationale:</w:t>
+      </w:r>
+    </w:p>
+    <w:p>
+      <w:pPr>
+        <w:pStyle w:val="Compact"/>
+        <w:numPr>
+          <w:ilvl w:val="0"/>
+          <w:numId w:val="1002"/>
+        </w:numPr>
+      </w:pPr>
+      <w:r>
+        <w:rPr>
+          <w:b/>
+          <w:bCs/>
+        </w:rPr>
+        <w:t xml:space="preserve">Coarse mips</w:t>
+      </w:r>
+      <w:r>
+        <w:t xml:space="preserve"> </w:t>
+      </w:r>
+      <w:r>
+        <w:t xml:space="preserve">contain smoothed displacement — the error signal is broad but imprecise. Small steps explore cautiously, preventing the solver from crossing basin boundaries into folded regions.</w:t>
+      </w:r>
+    </w:p>
+    <w:p>
+      <w:pPr>
+        <w:pStyle w:val="Compact"/>
+        <w:numPr>
+          <w:ilvl w:val="0"/>
+          <w:numId w:val="1002"/>
+        </w:numPr>
+      </w:pPr>
+      <w:r>
+        <w:rPr>
+          <w:b/>
+          <w:bCs/>
+        </w:rPr>
+        <w:t xml:space="preserve">Fine mips</w:t>
+      </w:r>
+      <w:r>
+        <w:t xml:space="preserve"> </w:t>
+      </w:r>
+      <w:r>
+        <w:t xml:space="preserve">contain full-detail displacement — the error signal is precise. The solver is already in the correct basin (established by coarse iterations), so large steps snap directly to the exact solution.</w:t>
+      </w:r>
+    </w:p>
+    <w:p>
+      <w:pPr>
+        <w:pStyle w:val="FirstParagraph"/>
+      </w:pPr>
+      <w:r>
+        <w:t xml:space="preserve">The conventional damping schedule (aggressive first, gentle later) was found empirically to cause</w:t>
+      </w:r>
+      <w:r>
+        <w:t xml:space="preserve"> </w:t>
+      </w:r>
+      <w:r>
+        <w:rPr>
+          <w:b/>
+          <w:bCs/>
+        </w:rPr>
+        <w:t xml:space="preserve">more</w:t>
+      </w:r>
+      <w:r>
+        <w:t xml:space="preserve"> </w:t>
+      </w:r>
+      <w:r>
+        <w:t xml:space="preserve">fold-over: large corrections at coarse levels overshoot into wrong basins, and subsequent gentle corrections cannot escape.</w:t>
+      </w:r>
+    </w:p>
+    <w:p>
+      <w:pPr>
+        <w:pStyle w:val="BodyText"/>
+      </w:pPr>
+      <w:r>
+        <w:t xml:space="preserve">The constant</w:t>
+      </w:r>
+      <w:r>
+        <w:t xml:space="preserve"> </w:t>
+      </w:r>
+      <w:r>
+        <w:rPr>
+          <w:rStyle w:val="VerbatimChar"/>
+        </w:rPr>
+        <w:t xml:space="preserve">k</w:t>
+      </w:r>
+      <w:r>
+        <w:t xml:space="preserve"> </w:t>
+      </w:r>
+      <w:r>
+        <w:t xml:space="preserve">controls the overall displacement strength. Values in the range [0.3, 0.4] provide the best tradeoff between displacement fidelity and fold-over suppression. Lower values under-correct (reducing apparent displacement magnitude); higher values increase risk of basin crossing at coarse levels.</w:t>
+      </w:r>
+    </w:p>
+    <w:bookmarkEnd w:id="15"/>
+    <w:bookmarkStart w:id="16" w:name="identity-seed-vs.-coarse-seed"/>
+    <w:p>
+      <w:pPr>
+        <w:pStyle w:val="Heading4"/>
+      </w:pPr>
+      <w:r>
+        <w:t xml:space="preserve">3.1.4 Identity Seed vs. Coarse Seed</w:t>
+      </w:r>
+    </w:p>
+    <w:p>
+      <w:pPr>
+        <w:pStyle w:val="FirstParagraph"/>
+      </w:pPr>
+      <w:r>
+        <w:t xml:space="preserve">We initially followed the intuition that seeding from the coarsest mip (</w:t>
+      </w:r>
+      <w:r>
+        <w:rPr>
+          <w:rStyle w:val="VerbatimChar"/>
+        </w:rPr>
+        <w:t xml:space="preserve">source = myUV - A_coarse(myUV)</w:t>
+      </w:r>
+      <w:r>
+        <w:t xml:space="preserve">) would place Newton in the correct basin. This is the standard approach for Newton-based inversion: start with an approximate solution, then refine.</w:t>
+      </w:r>
+    </w:p>
+    <w:p>
+      <w:pPr>
+        <w:pStyle w:val="BodyText"/>
+      </w:pPr>
+      <w:r>
+        <w:t xml:space="preserve">Counterintuitively, the</w:t>
+      </w:r>
+      <w:r>
+        <w:t xml:space="preserve"> </w:t>
+      </w:r>
+      <w:r>
+        <w:rPr>
+          <w:b/>
+          <w:bCs/>
+        </w:rPr>
+        <w:t xml:space="preserve">identity seed</w:t>
+      </w:r>
+      <w:r>
+        <w:t xml:space="preserve"> </w:t>
+      </w:r>
+      <w:r>
+        <w:t xml:space="preserve">(</w:t>
+      </w:r>
+      <w:r>
+        <w:rPr>
+          <w:rStyle w:val="VerbatimChar"/>
+        </w:rPr>
+        <w:t xml:space="preserve">source = myUV</w:t>
+      </w:r>
+      <w:r>
+        <w:t xml:space="preserve">) produces better results. The coarse seed pre-commits to a basin based on averaged displacement, which can be misleading at feature boundaries where the coarse average blends displacement from both sides of a bump. The identity seed makes no such commitment — it starts with zero assumption and lets the ascending mip traversal discover the correct basin incrementally.</w:t>
+      </w:r>
+    </w:p>
+    <w:p>
+      <w:pPr>
+        <w:pStyle w:val="BodyText"/>
+      </w:pPr>
+      <w:r>
+        <w:t xml:space="preserve">This works because the ascending traversal itself acts as a progressive seed: each level contributes a small correction that compounds into the full solution. The first iteration (mip 3) provides roughly the same information as the coarse seed, but with a small cautious step that avoids over-commitment.</w:t>
+      </w:r>
+    </w:p>
+    <w:bookmarkEnd w:id="16"/>
+    <w:bookmarkEnd w:id="17"/>
+    <w:bookmarkStart w:id="18" w:name="X67f93c588895ccb0422c4969fc428e7fdce236f"/>
+    <w:p>
+      <w:pPr>
+        <w:pStyle w:val="Heading3"/>
+      </w:pPr>
+      <w:r>
+        <w:t xml:space="preserve">3.2 GBuffer Depth Biasing for Screen-Space Shadows</w:t>
+      </w:r>
+    </w:p>
+    <w:p>
+      <w:pPr>
+        <w:pStyle w:val="FirstParagraph"/>
+      </w:pPr>
+      <w:r>
+        <w:t xml:space="preserve">Screen-space contact shadow techniques [Bend Studio 2022] ray-march against a depth buffer to detect occlusion. We embed displacement into the hardware depth via</w:t>
+      </w:r>
+      <w:r>
+        <w:t xml:space="preserve"> </w:t>
+      </w:r>
+      <w:r>
+        <w:rPr>
+          <w:rStyle w:val="VerbatimChar"/>
+        </w:rPr>
+        <w:t xml:space="preserve">SV_DepthGreaterEqual</w:t>
+      </w:r>
+      <w:r>
+        <w:t xml:space="preserve">:</w:t>
+      </w:r>
+    </w:p>
+    <w:p>
+      <w:pPr>
+        <w:pStyle w:val="SourceCode"/>
+      </w:pPr>
+      <w:r>
+        <w:rPr>
+          <w:rStyle w:val="VerbatimChar"/>
+        </w:rPr>
+        <w:t xml:space="preserve">// Geometry pixel shader</w:t>
+      </w:r>
+      <w:r>
+        <w:br/>
+      </w:r>
+      <w:r>
+        <w:rPr>
+          <w:rStyle w:val="VerbatimChar"/>
+        </w:rPr>
+        <w:t xml:space="preserve">float3 toCamera = normalize(CameraPosition - worldPos);</w:t>
+      </w:r>
+      <w:r>
+        <w:br/>
+      </w:r>
+      <w:r>
+        <w:rPr>
+          <w:rStyle w:val="VerbatimChar"/>
+        </w:rPr>
+        <w:t xml:space="preserve">float hwBias = worldHeight * dot(toCamera, faceNormal);</w:t>
+      </w:r>
+      <w:r>
+        <w:br/>
+      </w:r>
+      <w:r>
+        <w:rPr>
+          <w:rStyle w:val="VerbatimChar"/>
+        </w:rPr>
+        <w:t xml:space="preserve">output.Depth = input.Depth + hwBias;  // SV_DepthGreaterEqual</w:t>
+      </w:r>
+    </w:p>
+    <w:p>
+      <w:pPr>
+        <w:pStyle w:val="FirstParagraph"/>
+      </w:pPr>
+      <w:r>
+        <w:t xml:space="preserve">The</w:t>
+      </w:r>
+      <w:r>
+        <w:t xml:space="preserve"> </w:t>
+      </w:r>
+      <w:r>
+        <w:rPr>
+          <w:rStyle w:val="VerbatimChar"/>
+        </w:rPr>
+        <w:t xml:space="preserve">SV_DepthGreaterEqual</w:t>
+      </w:r>
+      <w:r>
+        <w:t xml:space="preserve"> </w:t>
+      </w:r>
+      <w:r>
+        <w:t xml:space="preserve">semantic biases the hardware depth toward the camera, allowing early-Z to function correctly (the displaced depth is always closer than or equal to the conservative rasterized depth). The bias is view-dependent by construction — the projection of the height along the camera direction — ensuring correct shadow contact from all viewing angles.</w:t>
+      </w:r>
+    </w:p>
+    <w:p>
+      <w:pPr>
+        <w:pStyle w:val="BodyText"/>
+      </w:pPr>
+      <w:r>
+        <w:rPr>
+          <w:b/>
+          <w:bCs/>
+        </w:rPr>
+        <w:t xml:space="preserve">Note:</w:t>
+      </w:r>
+      <w:r>
+        <w:t xml:space="preserve"> </w:t>
+      </w:r>
+      <w:r>
+        <w:t xml:space="preserve">Using</w:t>
+      </w:r>
+      <w:r>
+        <w:t xml:space="preserve"> </w:t>
+      </w:r>
+      <w:r>
+        <w:rPr>
+          <w:rStyle w:val="VerbatimChar"/>
+        </w:rPr>
+        <w:t xml:space="preserve">SV_DepthGreaterEqual</w:t>
+      </w:r>
+      <w:r>
+        <w:t xml:space="preserve"> </w:t>
+      </w:r>
+      <w:r>
+        <w:t xml:space="preserve">requires</w:t>
+      </w:r>
+      <w:r>
+        <w:t xml:space="preserve"> </w:t>
+      </w:r>
+      <w:r>
+        <w:rPr>
+          <w:rStyle w:val="VerbatimChar"/>
+        </w:rPr>
+        <w:t xml:space="preserve">linear noperspective centroid</w:t>
+      </w:r>
+      <w:r>
+        <w:t xml:space="preserve"> </w:t>
+      </w:r>
+      <w:r>
+        <w:t xml:space="preserve">interpolation on</w:t>
+      </w:r>
+      <w:r>
+        <w:t xml:space="preserve"> </w:t>
+      </w:r>
+      <w:r>
+        <w:rPr>
+          <w:rStyle w:val="VerbatimChar"/>
+        </w:rPr>
+        <w:t xml:space="preserve">SV_Position</w:t>
+      </w:r>
+      <w:r>
+        <w:t xml:space="preserve"> </w:t>
+      </w:r>
+      <w:r>
+        <w:t xml:space="preserve">to satisfy D3D12 validation requirements.</w:t>
+      </w:r>
+    </w:p>
+    <w:bookmarkEnd w:id="18"/>
+    <w:bookmarkStart w:id="19" w:name="half-precision-sentinel"/>
+    <w:p>
+      <w:pPr>
+        <w:pStyle w:val="Heading3"/>
+      </w:pPr>
+      <w:r>
+        <w:t xml:space="preserve">3.3 Half-Precision Sentinel</w:t>
+      </w:r>
+    </w:p>
+    <w:p>
+      <w:pPr>
+        <w:pStyle w:val="FirstParagraph"/>
+      </w:pPr>
+      <w:r>
+        <w:t xml:space="preserve">The B buffer uses R16G16_Float for memory efficiency, following Lobel’s original use of half-float storage. However, half-precision cannot exactly represent arbitrary UV coordinates — at 1920px width, the quantization error can exceed 1 pixel near screen edges.</w:t>
+      </w:r>
+    </w:p>
+    <w:p>
+      <w:pPr>
+        <w:pStyle w:val="BodyText"/>
+      </w:pPr>
+      <w:r>
+        <w:t xml:space="preserve">For non-displaced pixels (meshes, sky), Lobel’s formulation stores the identity UV (</w:t>
+      </w:r>
+      <w:r>
+        <w:rPr>
+          <w:rStyle w:val="VerbatimChar"/>
+        </w:rPr>
+        <w:t xml:space="preserve">myUV</w:t>
+      </w:r>
+      <w:r>
+        <w:t xml:space="preserve">), which should produce zero offset. In half-precision, this identity is quantized, introducing random ±1px jitter that manifests as visible halos at object silhouettes.</w:t>
+      </w:r>
+    </w:p>
+    <w:p>
+      <w:pPr>
+        <w:pStyle w:val="BodyText"/>
+      </w:pPr>
+      <w:r>
+        <w:rPr>
+          <w:b/>
+          <w:bCs/>
+        </w:rPr>
         <w:t xml:space="preserve">Solution.</w:t>
       </w:r>
       <w:r>
@@ -891,7 +1385,7 @@
         <w:rPr>
           <w:rStyle w:val="VerbatimChar"/>
         </w:rPr>
-        <w:t xml:space="preserve">// Producer (CSRefine / CSDisplace)</w:t>
+        <w:t xml:space="preserve">// Producer (CSRefine)</w:t>
       </w:r>
       <w:r>
         <w:br/>
@@ -965,11 +1459,11 @@
         <w:pStyle w:val="FirstParagraph"/>
       </w:pPr>
       <w:r>
-        <w:t xml:space="preserve">This cleanly separates displaced terrain pixels from non-displaced geometry with zero false positives.</w:t>
-      </w:r>
-    </w:p>
-    <w:bookmarkEnd w:id="15"/>
-    <w:bookmarkStart w:id="16" w:name="displacement-proportional-edge-fade"/>
+        <w:t xml:space="preserve">This cleanly separates displaced pixels from non-displaced geometry with zero false positives.</w:t>
+      </w:r>
+    </w:p>
+    <w:bookmarkEnd w:id="19"/>
+    <w:bookmarkStart w:id="20" w:name="displacement-proportional-edge-fade"/>
     <w:p>
       <w:pPr>
         <w:pStyle w:val="Heading3"/>
@@ -1057,9 +1551,9 @@
         </w:pict>
       </w:r>
     </w:p>
-    <w:bookmarkEnd w:id="16"/>
-    <w:bookmarkEnd w:id="17"/>
-    <w:bookmarkStart w:id="19" w:name="gbuffer-composition"/>
+    <w:bookmarkEnd w:id="20"/>
+    <w:bookmarkEnd w:id="21"/>
+    <w:bookmarkStart w:id="24" w:name="gbuffer-composition"/>
     <w:p>
       <w:pPr>
         <w:pStyle w:val="Heading2"/>
@@ -1148,10 +1642,10 @@
         <w:t xml:space="preserve">looks like</w:t>
       </w:r>
       <w:r>
-        <w:t xml:space="preserve">. The light buffer is computed at original coordinates using the same displacement, ensuring consistency.</w:t>
-      </w:r>
-    </w:p>
-    <w:bookmarkStart w:id="18" w:name="forward-displacement-vectors"/>
+        <w:t xml:space="preserve">.</w:t>
+      </w:r>
+    </w:p>
+    <w:bookmarkStart w:id="22" w:name="forward-displacement-vectors"/>
     <w:p>
       <w:pPr>
         <w:pStyle w:val="Heading3"/>
@@ -1165,7 +1659,7 @@
         <w:pStyle w:val="FirstParagraph"/>
       </w:pPr>
       <w:r>
-        <w:t xml:space="preserve">During the GBuffer pass, the terrain pixel shader computes the displacement vector by projecting both the surface point and its height-displaced position to clip space:</w:t>
+        <w:t xml:space="preserve">During the GBuffer pass, any pixel shader that supports displacement computes the displacement vector by projecting both the surface point and its height-displaced position to clip space:</w:t>
       </w:r>
     </w:p>
     <w:p>
@@ -1220,7 +1714,7 @@
         <w:pStyle w:val="FirstParagraph"/>
       </w:pPr>
       <w:r>
-        <w:t xml:space="preserve">Non-terrain shaders write the</w:t>
+        <w:t xml:space="preserve">Shaders that do not participate in displacement write the</w:t>
       </w:r>
       <w:r>
         <w:t xml:space="preserve"> </w:t>
@@ -1236,6 +1730,139 @@
       </w:r>
       <w:r>
         <w:t xml:space="preserve">sentinel to the displacement render target.</w:t>
+      </w:r>
+    </w:p>
+    <w:bookmarkEnd w:id="22"/>
+    <w:bookmarkStart w:id="23" w:name="displaced-depth-for-contact-shadows"/>
+    <w:p>
+      <w:pPr>
+        <w:pStyle w:val="Heading3"/>
+      </w:pPr>
+      <w:r>
+        <w:t xml:space="preserve">4.2 Displaced Depth for Contact Shadows</w:t>
+      </w:r>
+    </w:p>
+    <w:p>
+      <w:pPr>
+        <w:pStyle w:val="FirstParagraph"/>
+      </w:pPr>
+      <w:r>
+        <w:t xml:space="preserve">The B buffer’s source UVs are also used to remap the GBuffer depth, producing a displaced depth buffer for screen-space shadow consumption:</w:t>
+      </w:r>
+    </w:p>
+    <w:p>
+      <w:pPr>
+        <w:pStyle w:val="SourceCode"/>
+      </w:pPr>
+      <w:r>
+        <w:rPr>
+          <w:rStyle w:val="VerbatimChar"/>
+        </w:rPr>
+        <w:t xml:space="preserve">void CSDisplaceDepth(uint3 dtid : SV_DispatchThreadID)</w:t>
+      </w:r>
+      <w:r>
+        <w:br/>
+      </w:r>
+      <w:r>
+        <w:rPr>
+          <w:rStyle w:val="VerbatimChar"/>
+        </w:rPr>
+        <w:t xml:space="preserve">{</w:t>
+      </w:r>
+      <w:r>
+        <w:br/>
+      </w:r>
+      <w:r>
+        <w:rPr>
+          <w:rStyle w:val="VerbatimChar"/>
+        </w:rPr>
+        <w:t xml:space="preserve">    float2 sourceUV = ssdmB.Load(int3(dtid.xy, 0));</w:t>
+      </w:r>
+      <w:r>
+        <w:br/>
+      </w:r>
+      <w:r>
+        <w:br/>
+      </w:r>
+      <w:r>
+        <w:rPr>
+          <w:rStyle w:val="VerbatimChar"/>
+        </w:rPr>
+        <w:t xml:space="preserve">    // Gather 2x2 texel quad, take min depth to prevent</w:t>
+      </w:r>
+      <w:r>
+        <w:br/>
+      </w:r>
+      <w:r>
+        <w:rPr>
+          <w:rStyle w:val="VerbatimChar"/>
+        </w:rPr>
+        <w:t xml:space="preserve">    // false shadow pockets from Newton residual errors.</w:t>
+      </w:r>
+      <w:r>
+        <w:br/>
+      </w:r>
+      <w:r>
+        <w:rPr>
+          <w:rStyle w:val="VerbatimChar"/>
+        </w:rPr>
+        <w:t xml:space="preserve">    float4 g = depthIn.GatherRed(BilinearClamp, sourceUV);</w:t>
+      </w:r>
+      <w:r>
+        <w:br/>
+      </w:r>
+      <w:r>
+        <w:rPr>
+          <w:rStyle w:val="VerbatimChar"/>
+        </w:rPr>
+        <w:t xml:space="preserve">    depthOut[dtid.xy] = min(min(g.x, g.y), min(g.z, g.w));</w:t>
+      </w:r>
+      <w:r>
+        <w:br/>
+      </w:r>
+      <w:r>
+        <w:rPr>
+          <w:rStyle w:val="VerbatimChar"/>
+        </w:rPr>
+        <w:t xml:space="preserve">}</w:t>
+      </w:r>
+    </w:p>
+    <w:p>
+      <w:pPr>
+        <w:pStyle w:val="FirstParagraph"/>
+      </w:pPr>
+      <w:r>
+        <w:t xml:space="preserve">The</w:t>
+      </w:r>
+      <w:r>
+        <w:t xml:space="preserve"> </w:t>
+      </w:r>
+      <w:r>
+        <w:rPr>
+          <w:rStyle w:val="VerbatimChar"/>
+        </w:rPr>
+        <w:t xml:space="preserve">GatherRed</w:t>
+      </w:r>
+      <w:r>
+        <w:t xml:space="preserve"> </w:t>
+      </w:r>
+      <w:r>
+        <w:t xml:space="preserve">+</w:t>
+      </w:r>
+      <w:r>
+        <w:t xml:space="preserve"> </w:t>
+      </w:r>
+      <w:r>
+        <w:rPr>
+          <w:rStyle w:val="VerbatimChar"/>
+        </w:rPr>
+        <w:t xml:space="preserve">min</w:t>
+      </w:r>
+      <w:r>
+        <w:t xml:space="preserve"> </w:t>
+      </w:r>
+      <w:r>
+        <w:t xml:space="preserve">pattern fetches the 2×2 texel neighborhood in a single operation and selects the nearest depth, preventing tiny Newton convergence residuals from creating false depth pockets that screen-space shadows would interpret as occluders.</w:t>
       </w:r>
     </w:p>
     <w:p>
@@ -1245,9 +1872,9 @@
         </w:pict>
       </w:r>
     </w:p>
-    <w:bookmarkEnd w:id="18"/>
-    <w:bookmarkEnd w:id="19"/>
-    <w:bookmarkStart w:id="20" w:name="results-and-performance"/>
+    <w:bookmarkEnd w:id="23"/>
+    <w:bookmarkEnd w:id="24"/>
+    <w:bookmarkStart w:id="25" w:name="results-and-performance"/>
     <w:p>
       <w:pPr>
         <w:pStyle w:val="Heading2"/>
@@ -1395,7 +2022,7 @@
               <w:pStyle w:val="Compact"/>
             </w:pPr>
             <w:r>
-              <w:t xml:space="preserve">CSRefine (4 Newton iterations)</w:t>
+              <w:t xml:space="preserve">CSRefine (4 iterations)</w:t>
             </w:r>
           </w:p>
         </w:tc>
@@ -1418,6 +2045,41 @@
             </w:pPr>
             <w:r>
               <w:t xml:space="preserve">~0.15ms</w:t>
+            </w:r>
+          </w:p>
+        </w:tc>
+      </w:tr>
+      <w:tr>
+        <w:tc>
+          <w:tcPr/>
+          <w:p>
+            <w:pPr>
+              <w:pStyle w:val="Compact"/>
+            </w:pPr>
+            <w:r>
+              <w:t xml:space="preserve">CSDisplaceDepth</w:t>
+            </w:r>
+          </w:p>
+        </w:tc>
+        <w:tc>
+          <w:tcPr/>
+          <w:p>
+            <w:pPr>
+              <w:pStyle w:val="Compact"/>
+            </w:pPr>
+            <w:r>
+              <w:t xml:space="preserve">Full</w:t>
+            </w:r>
+          </w:p>
+        </w:tc>
+        <w:tc>
+          <w:tcPr/>
+          <w:p>
+            <w:pPr>
+              <w:pStyle w:val="Compact"/>
+            </w:pPr>
+            <w:r>
+              <w:t xml:space="preserve">~0.03ms</w:t>
             </w:r>
           </w:p>
         </w:tc>
@@ -1457,7 +2119,7 @@
                 <w:b/>
                 <w:bCs/>
               </w:rPr>
-              <w:t xml:space="preserve">~0.22ms</w:t>
+              <w:t xml:space="preserve">~0.25ms</w:t>
             </w:r>
           </w:p>
         </w:tc>
@@ -1468,7 +2130,7 @@
         <w:pStyle w:val="BodyText"/>
       </w:pPr>
       <w:r>
-        <w:t xml:space="preserve">The entire displacement pipeline costs roughly the same as a single POM material at 64 steps, but applies to all terrain pixels simultaneously and is independent of scene complexity.</w:t>
+        <w:t xml:space="preserve">The entire displacement pipeline costs roughly the same as a single POM material at 64 steps, but applies to all displaced pixels simultaneously and is independent of scene complexity.</w:t>
       </w:r>
     </w:p>
     <w:p>
@@ -1492,7 +2154,7 @@
           <w:i/>
           <w:iCs/>
         </w:rPr>
-        <w:t xml:space="preserve">[TODO: Convergence analysis — Newton error vs iteration count, comparison with barycentric descent]</w:t>
+        <w:t xml:space="preserve">[TODO: Convergence analysis — Newton error vs iteration count, effect of k parameter on fold-over frequency]</w:t>
       </w:r>
     </w:p>
     <w:p>
@@ -1502,8 +2164,8 @@
         </w:pict>
       </w:r>
     </w:p>
-    <w:bookmarkEnd w:id="20"/>
-    <w:bookmarkStart w:id="21" w:name="limitations"/>
+    <w:bookmarkEnd w:id="25"/>
+    <w:bookmarkStart w:id="26" w:name="limitations"/>
     <w:p>
       <w:pPr>
         <w:pStyle w:val="Heading2"/>
@@ -1514,336 +2176,191 @@
     </w:p>
     <w:p>
       <w:pPr>
-        <w:numPr>
-          <w:ilvl w:val="0"/>
-          <w:numId w:val="1002"/>
-        </w:numPr>
-      </w:pPr>
-      <w:r>
-        <w:rPr>
-          <w:b/>
-          <w:bCs/>
-        </w:rPr>
-        <w:t xml:space="preserve">Small displacement regime.</w:t>
-      </w:r>
-      <w:r>
-        <w:t xml:space="preserve"> </w:t>
-      </w:r>
-      <w:r>
-        <w:t xml:space="preserve">The technique works best at 1–5 pixel displacements. Beyond ~10px, screen-edge artifacts and the coarse seed’s approximation error become visible.</w:t>
-      </w:r>
-    </w:p>
-    <w:p>
-      <w:pPr>
-        <w:numPr>
-          <w:ilvl w:val="0"/>
-          <w:numId w:val="1002"/>
-        </w:numPr>
-      </w:pPr>
-      <w:r>
-        <w:rPr>
-          <w:b/>
-          <w:bCs/>
-        </w:rPr>
-        <w:t xml:space="preserve">No silhouette displacement.</w:t>
-      </w:r>
-      <w:r>
-        <w:t xml:space="preserve"> </w:t>
-      </w:r>
-      <w:r>
-        <w:t xml:space="preserve">As a screen-space remap, the technique cannot alter object silhouettes. It produces parallax within existing geometry boundaries.</w:t>
-      </w:r>
-    </w:p>
-    <w:p>
-      <w:pPr>
-        <w:numPr>
-          <w:ilvl w:val="0"/>
-          <w:numId w:val="1002"/>
-        </w:numPr>
-      </w:pPr>
-      <w:r>
-        <w:rPr>
-          <w:b/>
-          <w:bCs/>
-        </w:rPr>
-        <w:t xml:space="preserve">Fold-over at extreme scales.</w:t>
-      </w:r>
-      <w:r>
-        <w:t xml:space="preserve"> </w:t>
-      </w:r>
-      <w:r>
-        <w:t xml:space="preserve">While the coarse seed eliminates most folds, very sharp height discontinuities at high displacement scales can still produce minor artifacts. Gradient-based height smoothing (using</w:t>
-      </w:r>
-      <w:r>
-        <w:t xml:space="preserve"> </w:t>
-      </w:r>
-      <w:r>
-        <w:rPr>
-          <w:rStyle w:val="VerbatimChar"/>
-        </w:rPr>
-        <w:t xml:space="preserve">ddx</w:t>
-      </w:r>
-      <w:r>
-        <w:t xml:space="preserve">/</w:t>
-      </w:r>
-      <w:r>
-        <w:rPr>
-          <w:rStyle w:val="VerbatimChar"/>
-        </w:rPr>
-        <w:t xml:space="preserve">ddy</w:t>
-      </w:r>
-      <w:r>
-        <w:t xml:space="preserve">) mitigates this at the cost of fine detail.</w:t>
-      </w:r>
-    </w:p>
-    <w:p>
-      <w:pPr>
-        <w:numPr>
-          <w:ilvl w:val="0"/>
-          <w:numId w:val="1002"/>
-        </w:numPr>
-      </w:pPr>
-      <w:r>
-        <w:rPr>
-          <w:b/>
-          <w:bCs/>
-        </w:rPr>
-        <w:t xml:space="preserve">Screen-space limitations.</w:t>
-      </w:r>
-      <w:r>
-        <w:t xml:space="preserve"> </w:t>
-      </w:r>
-      <w:r>
-        <w:t xml:space="preserve">Content beyond the viewport cannot be displaced into view. The displacement-proportional edge fade (§3.4) masks this gracefully but reduces the effect near screen borders.</w:t>
-      </w:r>
-    </w:p>
-    <w:p>
-      <w:pPr>
-        <w:numPr>
-          <w:ilvl w:val="0"/>
-          <w:numId w:val="1002"/>
-        </w:numPr>
-      </w:pPr>
-      <w:r>
-        <w:rPr>
-          <w:b/>
-          <w:bCs/>
-        </w:rPr>
-        <w:t xml:space="preserve">Depth/GBuffer consistency.</w:t>
-      </w:r>
-      <w:r>
-        <w:t xml:space="preserve"> </w:t>
-      </w:r>
-      <w:r>
-        <w:t xml:space="preserve">The displaced GBuffer read and the original depth define slightly different surfaces. At depth discontinuities (terrain/mesh boundaries), this mismatch can produce 1px lighting artifacts if not handled by the sentinel system.</w:t>
-      </w:r>
-    </w:p>
-    <w:p>
-      <w:r>
-        <w:pict>
-          <v:rect style="width:0;height:1.5pt" o:hralign="center" o:hrstd="t" o:hr="t"/>
-        </w:pict>
-      </w:r>
-    </w:p>
-    <w:bookmarkEnd w:id="21"/>
-    <w:bookmarkStart w:id="22" w:name="conclusion"/>
-    <w:p>
-      <w:pPr>
-        <w:pStyle w:val="Heading2"/>
-      </w:pPr>
-      <w:r>
-        <w:t xml:space="preserve">7. Conclusion</w:t>
-      </w:r>
-    </w:p>
-    <w:p>
-      <w:pPr>
-        <w:pStyle w:val="FirstParagraph"/>
-      </w:pPr>
-      <w:r>
-        <w:t xml:space="preserve">We have presented practical improvements to Lobel’s Screen-Space Displacement Mapping technique. The coarse-seeded Newton inversion replaces the original level-by-level descent with a more robust and efficient approach, while the half-precision sentinel, GBuffer depth biasing, and edge fade address practical challenges encountered when integrating SSDM into a modern deferred rendering pipeline. The technique adds ~0.2ms to the frame, produces convincing heightmap parallax for terrain, and integrates naturally with existing screen-space shadow systems.</w:t>
-      </w:r>
-    </w:p>
-    <w:p>
-      <w:r>
-        <w:pict>
-          <v:rect style="width:0;height:1.5pt" o:hralign="center" o:hrstd="t" o:hr="t"/>
-        </w:pict>
-      </w:r>
-    </w:p>
-    <w:bookmarkEnd w:id="22"/>
-    <w:bookmarkStart w:id="23" w:name="acknowledgments"/>
-    <w:p>
-      <w:pPr>
-        <w:pStyle w:val="Heading2"/>
-      </w:pPr>
-      <w:r>
-        <w:t xml:space="preserve">Acknowledgments</w:t>
-      </w:r>
-    </w:p>
-    <w:p>
-      <w:pPr>
-        <w:pStyle w:val="FirstParagraph"/>
-      </w:pPr>
-      <w:r>
-        <w:t xml:space="preserve">This technique was developed collaboratively with Claude (Anthropic) through iterative pair-programming sessions. The coarse-seeded Newton inversion emerged from exploration of fold-over mitigations, with the AI assistant contributing implementation proposals and the author providing direction, visual evaluation, and domain expertise.</w:t>
-      </w:r>
-    </w:p>
-    <w:p>
-      <w:pPr>
-        <w:pStyle w:val="BodyText"/>
-      </w:pPr>
-      <w:r>
-        <w:t xml:space="preserve">The Freefall engine served as the development and testing platform.</w:t>
-      </w:r>
-    </w:p>
-    <w:bookmarkEnd w:id="23"/>
-    <w:bookmarkStart w:id="24" w:name="references"/>
-    <w:p>
-      <w:pPr>
-        <w:pStyle w:val="Heading2"/>
-      </w:pPr>
-      <w:r>
-        <w:t xml:space="preserve">References</w:t>
-      </w:r>
-    </w:p>
-    <w:p>
-      <w:pPr>
-        <w:pStyle w:val="Compact"/>
         <w:numPr>
           <w:ilvl w:val="0"/>
           <w:numId w:val="1003"/>
         </w:numPr>
       </w:pPr>
       <w:r>
-        <w:t xml:space="preserve">Lobel, R.</w:t>
-      </w:r>
-      <w:r>
-        <w:t xml:space="preserve"> </w:t>
-      </w:r>
-      <w:r>
-        <w:rPr>
-          <w:i/>
-          <w:iCs/>
-        </w:rPr>
-        <w:t xml:space="preserve">SSDM: Screen Space Displacement Mapping.</w:t>
-      </w:r>
-      <w:r>
-        <w:t xml:space="preserve"> </w:t>
-      </w:r>
-      <w:r>
-        <w:t xml:space="preserve">2008.</w:t>
-      </w:r>
-    </w:p>
-    <w:p>
-      <w:pPr>
-        <w:pStyle w:val="Compact"/>
+        <w:rPr>
+          <w:b/>
+          <w:bCs/>
+        </w:rPr>
+        <w:t xml:space="preserve">Small displacement regime.</w:t>
+      </w:r>
+      <w:r>
+        <w:t xml:space="preserve"> </w:t>
+      </w:r>
+      <w:r>
+        <w:t xml:space="preserve">The technique works best at 1–5 pixel displacements. Beyond ~10px, screen-edge artifacts become visible despite the edge fade.</w:t>
+      </w:r>
+    </w:p>
+    <w:p>
+      <w:pPr>
         <w:numPr>
           <w:ilvl w:val="0"/>
           <w:numId w:val="1003"/>
         </w:numPr>
       </w:pPr>
       <w:r>
-        <w:t xml:space="preserve">Tatarchuk, N.</w:t>
-      </w:r>
-      <w:r>
-        <w:t xml:space="preserve"> </w:t>
-      </w:r>
-      <w:r>
-        <w:rPr>
-          <w:i/>
-          <w:iCs/>
-        </w:rPr>
-        <w:t xml:space="preserve">Dynamic Parallax Occlusion Mapping with Approximate Soft Shadows.</w:t>
-      </w:r>
-      <w:r>
-        <w:t xml:space="preserve"> </w:t>
-      </w:r>
-      <w:r>
-        <w:t xml:space="preserve">I3D 2006.</w:t>
-      </w:r>
-    </w:p>
-    <w:p>
-      <w:pPr>
-        <w:pStyle w:val="Compact"/>
+        <w:rPr>
+          <w:b/>
+          <w:bCs/>
+        </w:rPr>
+        <w:t xml:space="preserve">Limited silhouette displacement.</w:t>
+      </w:r>
+      <w:r>
+        <w:t xml:space="preserve"> </w:t>
+      </w:r>
+      <w:r>
+        <w:t xml:space="preserve">The pixel remap does alter apparent silhouettes — a flat surface edge gains visible bumps from the displacement. However, it cannot extend beyond the rasterized footprint: pixels that were never rendered cannot be displaced into view. True geometric displacement (tessellation, mesh shading) remains necessary for large-scale silhouette changes.</w:t>
+      </w:r>
+    </w:p>
+    <w:p>
+      <w:pPr>
         <w:numPr>
           <w:ilvl w:val="0"/>
           <w:numId w:val="1003"/>
         </w:numPr>
       </w:pPr>
       <w:r>
-        <w:t xml:space="preserve">Policarpo, F., Oliveira, M. M., Comba, J. L. D.</w:t>
-      </w:r>
-      <w:r>
-        <w:t xml:space="preserve"> </w:t>
-      </w:r>
-      <w:r>
-        <w:rPr>
-          <w:i/>
-          <w:iCs/>
-        </w:rPr>
-        <w:t xml:space="preserve">Real-Time Relief Mapping on Arbitrary Polygonal Surfaces.</w:t>
-      </w:r>
-      <w:r>
-        <w:t xml:space="preserve"> </w:t>
-      </w:r>
-      <w:r>
-        <w:t xml:space="preserve">I3D 2005.</w:t>
-      </w:r>
-    </w:p>
-    <w:p>
-      <w:pPr>
-        <w:pStyle w:val="Compact"/>
+        <w:rPr>
+          <w:b/>
+          <w:bCs/>
+        </w:rPr>
+        <w:t xml:space="preserve">Residual fold-over.</w:t>
+      </w:r>
+      <w:r>
+        <w:t xml:space="preserve"> </w:t>
+      </w:r>
+      <w:r>
+        <w:t xml:space="preserve">While the hierarchical Newton with inverse annealing virtually eliminates folds, genuinely non-injective regions (where the forward mapping is multi-valued) cannot be fully resolved without depth-ordering — which would require multiple displacement passes.</w:t>
+      </w:r>
+    </w:p>
+    <w:p>
+      <w:pPr>
         <w:numPr>
           <w:ilvl w:val="0"/>
           <w:numId w:val="1003"/>
         </w:numPr>
       </w:pPr>
       <w:r>
-        <w:t xml:space="preserve">Wang, L., Wang, X., Tong, X., Lin, S., Hu, S., Guo, B., Shum, H.-Y.</w:t>
-      </w:r>
-      <w:r>
-        <w:t xml:space="preserve"> </w:t>
-      </w:r>
-      <w:r>
-        <w:rPr>
-          <w:i/>
-          <w:iCs/>
-        </w:rPr>
-        <w:t xml:space="preserve">View-Dependent Displacement Mapping.</w:t>
-      </w:r>
-      <w:r>
-        <w:t xml:space="preserve"> </w:t>
-      </w:r>
-      <w:r>
-        <w:t xml:space="preserve">SIGGRAPH 2003.</w:t>
-      </w:r>
-    </w:p>
-    <w:p>
-      <w:pPr>
-        <w:pStyle w:val="Compact"/>
+        <w:rPr>
+          <w:b/>
+          <w:bCs/>
+        </w:rPr>
+        <w:t xml:space="preserve">Screen-space limitations.</w:t>
+      </w:r>
+      <w:r>
+        <w:t xml:space="preserve"> </w:t>
+      </w:r>
+      <w:r>
+        <w:t xml:space="preserve">Content beyond the viewport cannot be displaced into view. The displacement-proportional edge fade (§3.4) masks this gracefully but reduces the effect near screen borders.</w:t>
+      </w:r>
+    </w:p>
+    <w:p>
+      <w:pPr>
         <w:numPr>
           <w:ilvl w:val="0"/>
           <w:numId w:val="1003"/>
         </w:numPr>
       </w:pPr>
       <w:r>
-        <w:t xml:space="preserve">Drobot, M.</w:t>
-      </w:r>
-      <w:r>
-        <w:t xml:space="preserve"> </w:t>
-      </w:r>
-      <w:r>
-        <w:rPr>
-          <w:i/>
-          <w:iCs/>
-        </w:rPr>
-        <w:t xml:space="preserve">Hybrid Reconstruction Anti-Aliasing.</w:t>
-      </w:r>
-      <w:r>
-        <w:t xml:space="preserve"> </w:t>
-      </w:r>
-      <w:r>
-        <w:t xml:space="preserve">GPU Pro 5, 2014.</w:t>
+        <w:rPr>
+          <w:b/>
+          <w:bCs/>
+        </w:rPr>
+        <w:t xml:space="preserve">Depth/GBuffer consistency.</w:t>
+      </w:r>
+      <w:r>
+        <w:t xml:space="preserve"> </w:t>
+      </w:r>
+      <w:r>
+        <w:t xml:space="preserve">The displaced GBuffer read and the original depth define slightly different surfaces. At depth discontinuities (e.g., object boundaries), this mismatch can produce 1px lighting artifacts if not handled by the sentinel system.</w:t>
+      </w:r>
+    </w:p>
+    <w:p>
+      <w:r>
+        <w:pict>
+          <v:rect style="width:0;height:1.5pt" o:hralign="center" o:hrstd="t" o:hr="t"/>
+        </w:pict>
+      </w:r>
+    </w:p>
+    <w:bookmarkEnd w:id="26"/>
+    <w:bookmarkStart w:id="27" w:name="conclusion"/>
+    <w:p>
+      <w:pPr>
+        <w:pStyle w:val="Heading2"/>
+      </w:pPr>
+      <w:r>
+        <w:t xml:space="preserve">7. Conclusion</w:t>
+      </w:r>
+    </w:p>
+    <w:p>
+      <w:pPr>
+        <w:pStyle w:val="FirstParagraph"/>
+      </w:pPr>
+      <w:r>
+        <w:t xml:space="preserve">We have presented practical improvements to Lobel’s Screen-Space Displacement Mapping technique. The hierarchical Newton inversion with inverse annealing replaces the original level-by-level descent with a more robust approach that virtually eliminates fold-over artifacts — the primary visual limitation of the original technique. The key insight is that the step schedule should be</w:t>
+      </w:r>
+      <w:r>
+        <w:t xml:space="preserve"> </w:t>
+      </w:r>
+      <w:r>
+        <w:rPr>
+          <w:b/>
+          <w:bCs/>
+        </w:rPr>
+        <w:t xml:space="preserve">inverted</w:t>
+      </w:r>
+      <w:r>
+        <w:t xml:space="preserve"> </w:t>
+      </w:r>
+      <w:r>
+        <w:t xml:space="preserve">relative to standard Newton damping: cautious exploration at coarse scales, confident convergence at fine scales. Combined with the half-precision sentinel, hardware depth biasing, and edge fade, the technique integrates cleanly into a modern deferred rendering pipeline at ~0.25ms per frame.</w:t>
+      </w:r>
+    </w:p>
+    <w:p>
+      <w:r>
+        <w:pict>
+          <v:rect style="width:0;height:1.5pt" o:hralign="center" o:hrstd="t" o:hr="t"/>
+        </w:pict>
+      </w:r>
+    </w:p>
+    <w:bookmarkEnd w:id="27"/>
+    <w:bookmarkStart w:id="28" w:name="acknowledgments"/>
+    <w:p>
+      <w:pPr>
+        <w:pStyle w:val="Heading2"/>
+      </w:pPr>
+      <w:r>
+        <w:t xml:space="preserve">Acknowledgments</w:t>
+      </w:r>
+    </w:p>
+    <w:p>
+      <w:pPr>
+        <w:pStyle w:val="FirstParagraph"/>
+      </w:pPr>
+      <w:r>
+        <w:t xml:space="preserve">This technique was developed collaboratively with Gemini (Google DeepMind) through iterative pair-programming sessions. The hierarchical Newton inversion and inverse annealing schedule emerged from systematic exploration of fold-over mitigations, with the AI assistant contributing implementation proposals and the author providing direction, visual evaluation, and the critical algorithmic insight of the inverse step schedule.</w:t>
+      </w:r>
+    </w:p>
+    <w:p>
+      <w:pPr>
+        <w:pStyle w:val="BodyText"/>
+      </w:pPr>
+      <w:r>
+        <w:t xml:space="preserve">The Freefall engine served as the development and testing platform.</w:t>
+      </w:r>
+    </w:p>
+    <w:bookmarkEnd w:id="28"/>
+    <w:bookmarkStart w:id="29" w:name="references"/>
+    <w:p>
+      <w:pPr>
+        <w:pStyle w:val="Heading2"/>
+      </w:pPr>
+      <w:r>
+        <w:t xml:space="preserve">References</w:t>
       </w:r>
     </w:p>
     <w:p>
@@ -1851,11 +2368,11 @@
         <w:pStyle w:val="Compact"/>
         <w:numPr>
           <w:ilvl w:val="0"/>
-          <w:numId w:val="1003"/>
+          <w:numId w:val="1004"/>
         </w:numPr>
       </w:pPr>
       <w:r>
-        <w:t xml:space="preserve">Stachowiak, T.</w:t>
+        <w:t xml:space="preserve">Lobel, R.</w:t>
       </w:r>
       <w:r>
         <w:t xml:space="preserve"> </w:t>
@@ -1865,13 +2382,13 @@
           <w:i/>
           <w:iCs/>
         </w:rPr>
-        <w:t xml:space="preserve">Stochastic Screen-Space Reflections.</w:t>
-      </w:r>
-      <w:r>
-        <w:t xml:space="preserve"> </w:t>
-      </w:r>
-      <w:r>
-        <w:t xml:space="preserve">SIGGRAPH 2015 Advances in Real-Time Rendering.</w:t>
+        <w:t xml:space="preserve">SSDM: Screen Space Displacement Mapping.</w:t>
+      </w:r>
+      <w:r>
+        <w:t xml:space="preserve"> </w:t>
+      </w:r>
+      <w:r>
+        <w:t xml:space="preserve">2008.</w:t>
       </w:r>
     </w:p>
     <w:p>
@@ -1879,7 +2396,147 @@
         <w:pStyle w:val="Compact"/>
         <w:numPr>
           <w:ilvl w:val="0"/>
-          <w:numId w:val="1003"/>
+          <w:numId w:val="1004"/>
+        </w:numPr>
+      </w:pPr>
+      <w:r>
+        <w:t xml:space="preserve">Tatarchuk, N.</w:t>
+      </w:r>
+      <w:r>
+        <w:t xml:space="preserve"> </w:t>
+      </w:r>
+      <w:r>
+        <w:rPr>
+          <w:i/>
+          <w:iCs/>
+        </w:rPr>
+        <w:t xml:space="preserve">Dynamic Parallax Occlusion Mapping with Approximate Soft Shadows.</w:t>
+      </w:r>
+      <w:r>
+        <w:t xml:space="preserve"> </w:t>
+      </w:r>
+      <w:r>
+        <w:t xml:space="preserve">I3D 2006.</w:t>
+      </w:r>
+    </w:p>
+    <w:p>
+      <w:pPr>
+        <w:pStyle w:val="Compact"/>
+        <w:numPr>
+          <w:ilvl w:val="0"/>
+          <w:numId w:val="1004"/>
+        </w:numPr>
+      </w:pPr>
+      <w:r>
+        <w:t xml:space="preserve">Policarpo, F., Oliveira, M. M., Comba, J. L. D.</w:t>
+      </w:r>
+      <w:r>
+        <w:t xml:space="preserve"> </w:t>
+      </w:r>
+      <w:r>
+        <w:rPr>
+          <w:i/>
+          <w:iCs/>
+        </w:rPr>
+        <w:t xml:space="preserve">Real-Time Relief Mapping on Arbitrary Polygonal Surfaces.</w:t>
+      </w:r>
+      <w:r>
+        <w:t xml:space="preserve"> </w:t>
+      </w:r>
+      <w:r>
+        <w:t xml:space="preserve">I3D 2005.</w:t>
+      </w:r>
+    </w:p>
+    <w:p>
+      <w:pPr>
+        <w:pStyle w:val="Compact"/>
+        <w:numPr>
+          <w:ilvl w:val="0"/>
+          <w:numId w:val="1004"/>
+        </w:numPr>
+      </w:pPr>
+      <w:r>
+        <w:t xml:space="preserve">Wang, L., Wang, X., Tong, X., Lin, S., Hu, S., Guo, B., Shum, H.-Y.</w:t>
+      </w:r>
+      <w:r>
+        <w:t xml:space="preserve"> </w:t>
+      </w:r>
+      <w:r>
+        <w:rPr>
+          <w:i/>
+          <w:iCs/>
+        </w:rPr>
+        <w:t xml:space="preserve">View-Dependent Displacement Mapping.</w:t>
+      </w:r>
+      <w:r>
+        <w:t xml:space="preserve"> </w:t>
+      </w:r>
+      <w:r>
+        <w:t xml:space="preserve">SIGGRAPH 2003.</w:t>
+      </w:r>
+    </w:p>
+    <w:p>
+      <w:pPr>
+        <w:pStyle w:val="Compact"/>
+        <w:numPr>
+          <w:ilvl w:val="0"/>
+          <w:numId w:val="1004"/>
+        </w:numPr>
+      </w:pPr>
+      <w:r>
+        <w:t xml:space="preserve">Drobot, M.</w:t>
+      </w:r>
+      <w:r>
+        <w:t xml:space="preserve"> </w:t>
+      </w:r>
+      <w:r>
+        <w:rPr>
+          <w:i/>
+          <w:iCs/>
+        </w:rPr>
+        <w:t xml:space="preserve">Hybrid Reconstruction Anti-Aliasing.</w:t>
+      </w:r>
+      <w:r>
+        <w:t xml:space="preserve"> </w:t>
+      </w:r>
+      <w:r>
+        <w:t xml:space="preserve">GPU Pro 5, 2014.</w:t>
+      </w:r>
+    </w:p>
+    <w:p>
+      <w:pPr>
+        <w:pStyle w:val="Compact"/>
+        <w:numPr>
+          <w:ilvl w:val="0"/>
+          <w:numId w:val="1004"/>
+        </w:numPr>
+      </w:pPr>
+      <w:r>
+        <w:t xml:space="preserve">Stachowiak, T.</w:t>
+      </w:r>
+      <w:r>
+        <w:t xml:space="preserve"> </w:t>
+      </w:r>
+      <w:r>
+        <w:rPr>
+          <w:i/>
+          <w:iCs/>
+        </w:rPr>
+        <w:t xml:space="preserve">Stochastic Screen-Space Reflections.</w:t>
+      </w:r>
+      <w:r>
+        <w:t xml:space="preserve"> </w:t>
+      </w:r>
+      <w:r>
+        <w:t xml:space="preserve">SIGGRAPH 2015 Advances in Real-Time Rendering.</w:t>
+      </w:r>
+    </w:p>
+    <w:p>
+      <w:pPr>
+        <w:pStyle w:val="Compact"/>
+        <w:numPr>
+          <w:ilvl w:val="0"/>
+          <w:numId w:val="1004"/>
         </w:numPr>
       </w:pPr>
       <w:r>
@@ -1909,8 +2566,8 @@
         </w:pict>
       </w:r>
     </w:p>
-    <w:bookmarkEnd w:id="24"/>
-    <w:bookmarkStart w:id="25" w:name="appendix-complete-hlsl"/>
+    <w:bookmarkEnd w:id="29"/>
+    <w:bookmarkStart w:id="30" w:name="appendix-complete-hlsl"/>
     <w:p>
       <w:pPr>
         <w:pStyle w:val="Heading2"/>
@@ -1928,11 +2585,11 @@
           <w:i/>
           <w:iCs/>
         </w:rPr>
-        <w:t xml:space="preserve">[TODO: Include complete shader source for CSScaleA, CSBuildMip, CSRefine, and the consumer displacement block from the lighting shader]</w:t>
-      </w:r>
-    </w:p>
-    <w:bookmarkEnd w:id="25"/>
-    <w:bookmarkEnd w:id="26"/>
+        <w:t xml:space="preserve">[TODO: Include complete shader source for CSScaleA, CSBuildMip, CSRefine, CSDisplaceDepth, and the consumer displacement block from the lighting shader]</w:t>
+      </w:r>
+    </w:p>
+    <w:bookmarkEnd w:id="30"/>
+    <w:bookmarkEnd w:id="31"/>
     <w:sectPr>
       <w:footnotePr>
         <w:numRestart w:val="eachSect"/>
@@ -2265,6 +2922,9 @@
     </w:lvlOverride>
   </w:num>
   <w:num w:numId="1002">
+    <w:abstractNumId w:val="991"/>
+  </w:num>
+  <w:num w:numId="1003">
     <w:abstractNumId w:val="99411"/>
     <w:lvlOverride w:ilvl="0">
       <w:startOverride w:val="1"/>
@@ -2294,7 +2954,7 @@
       <w:startOverride w:val="1"/>
     </w:lvlOverride>
   </w:num>
-  <w:num w:numId="1003">
+  <w:num w:numId="1004">
     <w:abstractNumId w:val="991"/>
   </w:num>
 </w:numbering>

</xml_diff>